<commit_message>
Add remaining project docs and workbook
</commit_message>
<xml_diff>
--- a/이어가기.docx
+++ b/이어가기.docx
@@ -225,8 +225,60 @@
     </w:p>
     <w:p/>
     <w:p>
-      <w:r>
-        <w:t xml:space="preserve">  원하면 제가 마지막으로 docs/SESSION_LOG.md에 “현재 중단 지점” 한 줄도 추가해둘 수 있습니다.</w:t>
+      <w:pPr>
+        <w:ind w:firstLine="225"/>
+      </w:pPr>
+      <w:r>
+        <w:t>원하면 제가 마지막으로 docs/SESSION_LOG.md에 “현재 중단 지점” 한 줄도 추가해둘 수 있습니다.</w:t>
+      </w:r>
+    </w:p>
+    <w:p>
+      <w:pPr>
+        <w:ind w:firstLine="225"/>
+        <w:rPr>
+          <w:rFonts w:hint="eastAsia"/>
+        </w:rPr>
+      </w:pPr>
+      <w:r>
+        <w:rPr>
+          <w:noProof/>
+        </w:rPr>
+        <w:lastRenderedPageBreak/>
+        <w:drawing>
+          <wp:inline distT="0" distB="0" distL="0" distR="0" wp14:anchorId="5F4E9E6D" wp14:editId="6ECEA0CC">
+            <wp:extent cx="5731510" cy="3223895"/>
+            <wp:effectExtent l="0" t="0" r="2540" b="0"/>
+            <wp:docPr id="623205088" name="그림 1"/>
+            <wp:cNvGraphicFramePr>
+              <a:graphicFrameLocks xmlns:a="http://schemas.openxmlformats.org/drawingml/2006/main" noChangeAspect="1"/>
+            </wp:cNvGraphicFramePr>
+            <a:graphic xmlns:a="http://schemas.openxmlformats.org/drawingml/2006/main">
+              <a:graphicData uri="http://schemas.openxmlformats.org/drawingml/2006/picture">
+                <pic:pic xmlns:pic="http://schemas.openxmlformats.org/drawingml/2006/picture">
+                  <pic:nvPicPr>
+                    <pic:cNvPr id="623205088" name=""/>
+                    <pic:cNvPicPr/>
+                  </pic:nvPicPr>
+                  <pic:blipFill>
+                    <a:blip r:embed="rId4"/>
+                    <a:stretch>
+                      <a:fillRect/>
+                    </a:stretch>
+                  </pic:blipFill>
+                  <pic:spPr>
+                    <a:xfrm>
+                      <a:off x="0" y="0"/>
+                      <a:ext cx="5731510" cy="3223895"/>
+                    </a:xfrm>
+                    <a:prstGeom prst="rect">
+                      <a:avLst/>
+                    </a:prstGeom>
+                  </pic:spPr>
+                </pic:pic>
+              </a:graphicData>
+            </a:graphic>
+          </wp:inline>
+        </w:drawing>
       </w:r>
     </w:p>
     <w:sectPr>

</xml_diff>

<commit_message>
Close Unit 1 validation milestone
</commit_message>
<xml_diff>
--- a/이어가기.docx
+++ b/이어가기.docx
@@ -3,283 +3,9 @@
 <w:document xmlns:wpc="http://schemas.microsoft.com/office/word/2010/wordprocessingCanvas" xmlns:cx="http://schemas.microsoft.com/office/drawing/2014/chartex" xmlns:cx1="http://schemas.microsoft.com/office/drawing/2015/9/8/chartex" xmlns:cx2="http://schemas.microsoft.com/office/drawing/2015/10/21/chartex" xmlns:cx3="http://schemas.microsoft.com/office/drawing/2016/5/9/chartex" xmlns:cx4="http://schemas.microsoft.com/office/drawing/2016/5/10/chartex" xmlns:cx5="http://schemas.microsoft.com/office/drawing/2016/5/11/chartex" xmlns:cx6="http://schemas.microsoft.com/office/drawing/2016/5/12/chartex" xmlns:cx7="http://schemas.microsoft.com/office/drawing/2016/5/13/chartex" xmlns:cx8="http://schemas.microsoft.com/office/drawing/2016/5/14/chartex" xmlns:mc="http://schemas.openxmlformats.org/markup-compatibility/2006" xmlns:aink="http://schemas.microsoft.com/office/drawing/2016/ink" xmlns:am3d="http://schemas.microsoft.com/office/drawing/2017/model3d" xmlns:o="urn:schemas-microsoft-com:office:office" xmlns:oel="http://schemas.microsoft.com/office/2019/extlst" xmlns:r="http://schemas.openxmlformats.org/officeDocument/2006/relationships" xmlns:m="http://schemas.openxmlformats.org/officeDocument/2006/math" xmlns:v="urn:schemas-microsoft-com:vml" xmlns:wp14="http://schemas.microsoft.com/office/word/2010/wordprocessingDrawing" xmlns:wp="http://schemas.openxmlformats.org/drawingml/2006/wordprocessingDrawing" xmlns:w10="urn:schemas-microsoft-com:office:word" xmlns:w="http://schemas.openxmlformats.org/wordprocessingml/2006/main" xmlns:w14="http://schemas.microsoft.com/office/word/2010/wordml" xmlns:w15="http://schemas.microsoft.com/office/word/2012/wordml" xmlns:w16cex="http://schemas.microsoft.com/office/word/2018/wordml/cex" xmlns:w16cid="http://schemas.microsoft.com/office/word/2016/wordml/cid" xmlns:w16="http://schemas.microsoft.com/office/word/2018/wordml" xmlns:w16du="http://schemas.microsoft.com/office/word/2023/wordml/word16du" xmlns:w16sdtdh="http://schemas.microsoft.com/office/word/2020/wordml/sdtdatahash" xmlns:w16sdtfl="http://schemas.microsoft.com/office/word/2024/wordml/sdtformatlock" xmlns:w16se="http://schemas.microsoft.com/office/word/2015/wordml/symex" xmlns:wpg="http://schemas.microsoft.com/office/word/2010/wordprocessingGroup" xmlns:wpi="http://schemas.microsoft.com/office/word/2010/wordprocessingInk" xmlns:wne="http://schemas.microsoft.com/office/word/2006/wordml" xmlns:wps="http://schemas.microsoft.com/office/word/2010/wordprocessingShape" mc:Ignorable="w14 w15 w16se w16cid w16 w16cex w16sdtdh w16sdtfl w16du wp14">
   <w:body>
     <w:p>
-      <w:r>
-        <w:rPr>
-          <w:rFonts w:hint="eastAsia"/>
-        </w:rPr>
-        <w:t>잠시</w:t>
-      </w:r>
-      <w:r>
-        <w:t xml:space="preserve"> 쉬어야 </w:t>
-      </w:r>
-      <w:proofErr w:type="spellStart"/>
-      <w:r>
-        <w:t>할것</w:t>
-      </w:r>
-      <w:proofErr w:type="spellEnd"/>
-      <w:r>
-        <w:t xml:space="preserve"> 같아. 중요 작업을 </w:t>
-      </w:r>
-      <w:proofErr w:type="gramStart"/>
-      <w:r>
-        <w:t>저장 해</w:t>
-      </w:r>
-      <w:proofErr w:type="gramEnd"/>
-      <w:r>
-        <w:t xml:space="preserve"> 주고, 다음에 시작 </w:t>
-      </w:r>
-      <w:proofErr w:type="spellStart"/>
-      <w:r>
-        <w:t>할때</w:t>
-      </w:r>
-      <w:proofErr w:type="spellEnd"/>
-      <w:r>
-        <w:t xml:space="preserve"> 어떻게 </w:t>
-      </w:r>
-      <w:proofErr w:type="gramStart"/>
-      <w:r>
-        <w:t>지시 하면</w:t>
-      </w:r>
-      <w:proofErr w:type="gramEnd"/>
-      <w:r>
-        <w:t xml:space="preserve"> </w:t>
-      </w:r>
-      <w:proofErr w:type="spellStart"/>
-      <w:r>
-        <w:t>이상없이</w:t>
-      </w:r>
-      <w:proofErr w:type="spellEnd"/>
-      <w:r>
-        <w:t xml:space="preserve"> 이어서 </w:t>
-      </w:r>
-      <w:proofErr w:type="gramStart"/>
-      <w:r>
-        <w:t>할까</w:t>
-      </w:r>
-      <w:proofErr w:type="gramEnd"/>
-    </w:p>
-    <w:p/>
-    <w:p/>
-    <w:p>
-      <w:r>
-        <w:rPr>
-          <w:rFonts w:hint="eastAsia"/>
-        </w:rPr>
-        <w:t>•</w:t>
-      </w:r>
-      <w:r>
-        <w:t xml:space="preserve"> 중요 작업은 이미 repo 안 문서로 남아 있어서, 다음에 그대로 이어가기 좋은 상태입니다.</w:t>
-      </w:r>
-    </w:p>
-    <w:p/>
-    <w:p>
-      <w:r>
-        <w:t xml:space="preserve">  현재 저장된 핵심은 이 파일들입니다.</w:t>
-      </w:r>
-    </w:p>
-    <w:p/>
-    <w:p>
-      <w:r>
-        <w:t xml:space="preserve">  - AGENTS.md</w:t>
-      </w:r>
-    </w:p>
-    <w:p>
-      <w:r>
-        <w:t xml:space="preserve">  - PROJECT_CONTEXT.md</w:t>
-      </w:r>
-    </w:p>
-    <w:p>
-      <w:r>
-        <w:t xml:space="preserve">  - docs/SESSION_LOG.md</w:t>
-      </w:r>
-    </w:p>
-    <w:p>
-      <w:r>
-        <w:t xml:space="preserve">  - docs/mastery-rules.md</w:t>
-      </w:r>
-    </w:p>
-    <w:p>
-      <w:r>
-        <w:t xml:space="preserve">  - docs/prerequisite-map.md</w:t>
-      </w:r>
-    </w:p>
-    <w:p>
-      <w:r>
-        <w:t xml:space="preserve">  - docs/recommendation-rules.md</w:t>
-      </w:r>
-    </w:p>
-    <w:p>
-      <w:r>
-        <w:t xml:space="preserve">  - docs/validation-checklist.md</w:t>
-      </w:r>
-    </w:p>
-    <w:p/>
-    <w:p>
-      <w:r>
-        <w:t xml:space="preserve">  특히 다음 시작점은 이렇습니다.</w:t>
-      </w:r>
-    </w:p>
-    <w:p/>
-    <w:p>
-      <w:r>
-        <w:t xml:space="preserve">  - Unit 1 소인수분해 worked example이 위 3개 source-of-truth 문서에 반영되어 있음</w:t>
-      </w:r>
-    </w:p>
-    <w:p>
-      <w:r>
-        <w:t xml:space="preserve">  - 근거로 사용한 외부 자료는 아래 2개뿐임</w:t>
-      </w:r>
-    </w:p>
-    <w:p>
-      <w:r>
-        <w:t xml:space="preserve">      - C:\MathFile\중1\중1_ 미래엔 </w:t>
-      </w:r>
-      <w:proofErr w:type="spellStart"/>
-      <w:r>
-        <w:t>중단원마무리</w:t>
-      </w:r>
-      <w:proofErr w:type="spellEnd"/>
-      <w:r>
-        <w:t>_1_1_소인수분해.pdf</w:t>
-      </w:r>
-    </w:p>
-    <w:p>
-      <w:r>
-        <w:t xml:space="preserve">      - C:\MathFile\중1\[수준별 문제은행_발전] Ⅰ-1. 소인수분해.pdf</w:t>
-      </w:r>
-    </w:p>
-    <w:p>
-      <w:r>
-        <w:t xml:space="preserve">  - 숫자 threshold, curriculum code, ranking weight는 아직 모두 UNDECIDED</w:t>
-      </w:r>
-    </w:p>
-    <w:p/>
-    <w:p>
-      <w:r>
-        <w:t xml:space="preserve">  다음에 가장 안전하게 이어서 시키는 문장은 이렇게 하면 됩니다.</w:t>
-      </w:r>
-    </w:p>
-    <w:p/>
-    <w:p>
-      <w:r>
-        <w:t xml:space="preserve">  PROJECT_CONTEXT.md, docs/SESSION_LOG.md, docs/mastery-rules.md, docs/prerequisite-map.md, docs/recommendation-rules.md</w:t>
-      </w:r>
-    </w:p>
-    <w:p>
-      <w:r>
-        <w:t xml:space="preserve">  </w:t>
-      </w:r>
-      <w:proofErr w:type="spellStart"/>
-      <w:r>
-        <w:t>를</w:t>
-      </w:r>
-      <w:proofErr w:type="spellEnd"/>
-      <w:r>
-        <w:t xml:space="preserve"> 먼저 읽고 이어서 작업해줘.</w:t>
-      </w:r>
-    </w:p>
-    <w:p>
-      <w:r>
-        <w:t xml:space="preserve">  Unit 1 소인수분해 상태를 기준으로 진행하고, 새 근거 없이는 curriculum code나 numeric threshold를 만들지 마.</w:t>
-      </w:r>
-    </w:p>
-    <w:p/>
-    <w:p>
-      <w:r>
-        <w:t xml:space="preserve">  조금 더 구체적으로 하려면 이렇게 시키면 됩니다.</w:t>
-      </w:r>
-    </w:p>
-    <w:p/>
-    <w:p>
-      <w:r>
-        <w:t xml:space="preserve">  PROJECT_CONTEXT.md와 docs 아래 source-of-truth 문서를 읽고,</w:t>
-      </w:r>
-    </w:p>
-    <w:p>
-      <w:r>
-        <w:t xml:space="preserve">  Unit 1 소인수분해 다음 작업만 진행해줘.</w:t>
-      </w:r>
-    </w:p>
-    <w:p>
-      <w:r>
-        <w:t xml:space="preserve">  기존 근거는 C:\MathFile\중1\중1_ 미래엔 </w:t>
-      </w:r>
-      <w:proofErr w:type="spellStart"/>
-      <w:r>
-        <w:t>중단원마무리</w:t>
-      </w:r>
-      <w:proofErr w:type="spellEnd"/>
-      <w:r>
-        <w:t>_1_1_소인수분해.pdf 와</w:t>
-      </w:r>
-    </w:p>
-    <w:p>
-      <w:r>
-        <w:t xml:space="preserve">  C:\MathFile\중1\[수준별 문제은행_발전] Ⅰ-1. 소인수분해.pdf 만 사용해.</w:t>
-      </w:r>
-    </w:p>
-    <w:p>
-      <w:r>
-        <w:t xml:space="preserve">  UNDECIDED 항목은 임의로 확정하지 마.</w:t>
-      </w:r>
-    </w:p>
-    <w:p/>
-    <w:p>
       <w:pPr>
         <w:ind w:firstLine="225"/>
       </w:pPr>
-      <w:r>
-        <w:t>원하면 제가 마지막으로 docs/SESSION_LOG.md에 “현재 중단 지점” 한 줄도 추가해둘 수 있습니다.</w:t>
-      </w:r>
-    </w:p>
-    <w:p>
-      <w:pPr>
-        <w:ind w:firstLine="225"/>
-        <w:rPr>
-          <w:rFonts w:hint="eastAsia"/>
-        </w:rPr>
-      </w:pPr>
-      <w:r>
-        <w:rPr>
-          <w:noProof/>
-        </w:rPr>
-        <w:lastRenderedPageBreak/>
-        <w:drawing>
-          <wp:inline distT="0" distB="0" distL="0" distR="0" wp14:anchorId="5F4E9E6D" wp14:editId="6ECEA0CC">
-            <wp:extent cx="5731510" cy="3223895"/>
-            <wp:effectExtent l="0" t="0" r="2540" b="0"/>
-            <wp:docPr id="623205088" name="그림 1"/>
-            <wp:cNvGraphicFramePr>
-              <a:graphicFrameLocks xmlns:a="http://schemas.openxmlformats.org/drawingml/2006/main" noChangeAspect="1"/>
-            </wp:cNvGraphicFramePr>
-            <a:graphic xmlns:a="http://schemas.openxmlformats.org/drawingml/2006/main">
-              <a:graphicData uri="http://schemas.openxmlformats.org/drawingml/2006/picture">
-                <pic:pic xmlns:pic="http://schemas.openxmlformats.org/drawingml/2006/picture">
-                  <pic:nvPicPr>
-                    <pic:cNvPr id="623205088" name=""/>
-                    <pic:cNvPicPr/>
-                  </pic:nvPicPr>
-                  <pic:blipFill>
-                    <a:blip r:embed="rId4"/>
-                    <a:stretch>
-                      <a:fillRect/>
-                    </a:stretch>
-                  </pic:blipFill>
-                  <pic:spPr>
-                    <a:xfrm>
-                      <a:off x="0" y="0"/>
-                      <a:ext cx="5731510" cy="3223895"/>
-                    </a:xfrm>
-                    <a:prstGeom prst="rect">
-                      <a:avLst/>
-                    </a:prstGeom>
-                  </pic:spPr>
-                </pic:pic>
-              </a:graphicData>
-            </a:graphic>
-          </wp:inline>
-        </w:drawing>
-      </w:r>
     </w:p>
     <w:sectPr>
       <w:pgSz w:w="11906" w:h="16838"/>

</xml_diff>